<commit_message>
docs: compile final PDF report with new EKS active screenshots
</commit_message>
<xml_diff>
--- a/docs/Project_Submission_Report.docx
+++ b/docs/Project_Submission_Report.docx
@@ -792,8 +792,8 @@
         </w:rPr>
         <w:drawing>
           <wp:inline distT="0" distB="0" distL="0" distR="0">
-            <wp:extent cx="5731510" cy="2459355"/>
-            <wp:effectExtent l="0" t="0" r="2540" b="0"/>
+            <wp:extent cx="5731510" cy="3044825"/>
+            <wp:effectExtent l="0" t="0" r="2540" b="3175"/>
             <wp:docPr id="6" name="Picture 6"/>
             <wp:cNvGraphicFramePr/>
             <a:graphic xmlns:a="http://schemas.openxmlformats.org/drawingml/2006/main">
@@ -804,7 +804,7 @@
                     <pic:cNvPicPr/>
                   </pic:nvPicPr>
                   <pic:blipFill>
-                    <a:blip r:embed="rId9" cstate="print">
+                    <a:blip r:embed="rId9">
                       <a:extLst>
                         <a:ext uri="{28A0092B-C50C-407E-A947-70E740481C1C}">
                           <a14:useLocalDpi xmlns:a14="http://schemas.microsoft.com/office/drawing/2010/main" val="0"/>
@@ -818,7 +818,7 @@
                   <pic:spPr>
                     <a:xfrm>
                       <a:off x="0" y="0"/>
-                      <a:ext cx="5731510" cy="2459355"/>
+                      <a:ext cx="5731510" cy="3044825"/>
                     </a:xfrm>
                     <a:prstGeom prst="rect">
                       <a:avLst/>
@@ -910,8 +910,8 @@
         </w:rPr>
         <w:drawing>
           <wp:inline distT="0" distB="0" distL="0" distR="0">
-            <wp:extent cx="5731510" cy="2531110"/>
-            <wp:effectExtent l="0" t="0" r="2540" b="2540"/>
+            <wp:extent cx="5731510" cy="3122930"/>
+            <wp:effectExtent l="0" t="0" r="2540" b="1270"/>
             <wp:docPr id="7" name="Picture 7"/>
             <wp:cNvGraphicFramePr/>
             <a:graphic xmlns:a="http://schemas.openxmlformats.org/drawingml/2006/main">
@@ -922,7 +922,7 @@
                     <pic:cNvPicPr/>
                   </pic:nvPicPr>
                   <pic:blipFill>
-                    <a:blip r:embed="rId10" cstate="print">
+                    <a:blip r:embed="rId10">
                       <a:extLst>
                         <a:ext uri="{28A0092B-C50C-407E-A947-70E740481C1C}">
                           <a14:useLocalDpi xmlns:a14="http://schemas.microsoft.com/office/drawing/2010/main" val="0"/>
@@ -936,7 +936,7 @@
                   <pic:spPr>
                     <a:xfrm>
                       <a:off x="0" y="0"/>
-                      <a:ext cx="5731510" cy="2531110"/>
+                      <a:ext cx="5731510" cy="3122930"/>
                     </a:xfrm>
                     <a:prstGeom prst="rect">
                       <a:avLst/>
@@ -1738,51 +1738,17 @@
           <w:rFonts w:ascii="Arial" w:hAnsi="Arial" w:cs="Arial"/>
           <w:b/>
           <w:color w:val="000000"/>
-          <w:sz w:val="32"/>
-        </w:rPr>
-      </w:pPr>
-      <w:r>
-        <w:rPr>
-          <w:rFonts w:ascii="Arial" w:hAnsi="Arial" w:cs="Arial"/>
-          <w:b/>
-          <w:color w:val="000000"/>
-          <w:sz w:val="32"/>
-        </w:rPr>
-        <w:t>6. Centralized Logging &amp; Monitoring Dashboards</w:t>
-      </w:r>
-    </w:p>
-    <w:p>
-      <w:pPr>
-        <w:rPr>
-          <w:rFonts w:ascii="Calibri" w:hAnsi="Calibri" w:cs="Calibri"/>
-          <w:color w:val="000000"/>
-        </w:rPr>
-      </w:pPr>
-      <w:r>
-        <w:rPr>
-          <w:rFonts w:ascii="Calibri" w:hAnsi="Calibri" w:cs="Calibri"/>
-          <w:color w:val="000000"/>
-        </w:rPr>
-        <w:t>Centralized telemetry dashboards monitor cluster behavior using Prometheus metrics, Grafana charts, and Loki log streams.</w:t>
-      </w:r>
-    </w:p>
-    <w:p>
-      <w:pPr>
-        <w:rPr>
-          <w:rFonts w:ascii="Arial" w:hAnsi="Arial" w:cs="Arial"/>
-          <w:b/>
-          <w:color w:val="000000"/>
-          <w:sz w:val="24"/>
-        </w:rPr>
-      </w:pPr>
-      <w:r>
-        <w:rPr>
-          <w:rFonts w:ascii="Arial" w:hAnsi="Arial" w:cs="Arial"/>
-          <w:b/>
-          <w:color w:val="000000"/>
-          <w:sz w:val="24"/>
-        </w:rPr>
-        <w:t>6.1 Grafana Monitoring Dashboard</w:t>
+          <w:sz w:val="24"/>
+        </w:rPr>
+      </w:pPr>
+      <w:r>
+        <w:rPr>
+          <w:rFonts w:ascii="Arial" w:hAnsi="Arial" w:cs="Arial"/>
+          <w:b/>
+          <w:color w:val="000000"/>
+          <w:sz w:val="24"/>
+        </w:rPr>
+        <w:t>5.4 EKS Pods and Services Running Verification</w:t>
       </w:r>
     </w:p>
     <w:p>
@@ -1816,8 +1782,8 @@
         </w:rPr>
         <w:drawing>
           <wp:inline distT="0" distB="0" distL="0" distR="0">
-            <wp:extent cx="4194048" cy="2340864"/>
-            <wp:effectExtent l="0" t="0" r="0" b="2540"/>
+            <wp:extent cx="5731510" cy="3044825"/>
+            <wp:effectExtent l="0" t="0" r="2540" b="3175"/>
             <wp:docPr id="14" name="Picture 14"/>
             <wp:cNvGraphicFramePr/>
             <a:graphic xmlns:a="http://schemas.openxmlformats.org/drawingml/2006/main">
@@ -1828,7 +1794,277 @@
                     <pic:cNvPicPr/>
                   </pic:nvPicPr>
                   <pic:blipFill>
-                    <a:blip r:embed="rId17" cstate="print">
+                    <a:blip r:embed="rId17">
+                      <a:extLst>
+                        <a:ext uri="{28A0092B-C50C-407E-A947-70E740481C1C}">
+                          <a14:useLocalDpi xmlns:a14="http://schemas.microsoft.com/office/drawing/2010/main" val="0"/>
+                        </a:ext>
+                      </a:extLst>
+                    </a:blip>
+                    <a:stretch>
+                      <a:fillRect/>
+                    </a:stretch>
+                  </pic:blipFill>
+                  <pic:spPr>
+                    <a:xfrm>
+                      <a:off x="0" y="0"/>
+                      <a:ext cx="5731510" cy="3044825"/>
+                    </a:xfrm>
+                    <a:prstGeom prst="rect">
+                      <a:avLst/>
+                    </a:prstGeom>
+                  </pic:spPr>
+                </pic:pic>
+              </a:graphicData>
+            </a:graphic>
+          </wp:inline>
+        </w:drawing>
+      </w:r>
+    </w:p>
+    <w:p>
+      <w:pPr>
+        <w:jc w:val="center"/>
+        <w:rPr>
+          <w:rFonts w:ascii="Calibri" w:hAnsi="Calibri" w:cs="Calibri"/>
+          <w:b/>
+          <w:color w:val="000000"/>
+        </w:rPr>
+      </w:pPr>
+      <w:r>
+        <w:rPr>
+          <w:rFonts w:ascii="Calibri" w:hAnsi="Calibri" w:cs="Calibri"/>
+          <w:b/>
+          <w:i/>
+          <w:color w:val="000000"/>
+          <w:sz w:val="18"/>
+        </w:rPr>
+        <w:t>Figure 5.5: Live EKS Namespace Pods and Services Status Check</w:t>
+      </w:r>
+    </w:p>
+    <w:p>
+      <w:pPr>
+        <w:rPr>
+          <w:rFonts w:ascii="Calibri" w:hAnsi="Calibri" w:cs="Calibri"/>
+          <w:b/>
+          <w:color w:val="000000"/>
+        </w:rPr>
+      </w:pPr>
+    </w:p>
+    <w:p>
+      <w:pPr>
+        <w:rPr>
+          <w:rFonts w:ascii="Arial" w:hAnsi="Arial" w:cs="Arial"/>
+          <w:b/>
+          <w:color w:val="000000"/>
+          <w:sz w:val="24"/>
+        </w:rPr>
+      </w:pPr>
+      <w:r>
+        <w:rPr>
+          <w:rFonts w:ascii="Arial" w:hAnsi="Arial" w:cs="Arial"/>
+          <w:b/>
+          <w:color w:val="000000"/>
+          <w:sz w:val="24"/>
+        </w:rPr>
+        <w:t>5.5 Kubernetes Sequenced Manual Apply Commands</w:t>
+      </w:r>
+    </w:p>
+    <w:p>
+      <w:pPr>
+        <w:rPr>
+          <w:rFonts w:ascii="Arial" w:hAnsi="Arial" w:cs="Arial"/>
+          <w:b/>
+          <w:color w:val="000000"/>
+          <w:sz w:val="24"/>
+        </w:rPr>
+      </w:pPr>
+    </w:p>
+    <w:p>
+      <w:pPr>
+        <w:jc w:val="center"/>
+        <w:rPr>
+          <w:rFonts w:ascii="Arial" w:hAnsi="Arial" w:cs="Arial"/>
+          <w:b/>
+          <w:color w:val="000000"/>
+          <w:sz w:val="24"/>
+        </w:rPr>
+      </w:pPr>
+      <w:r>
+        <w:rPr>
+          <w:rFonts w:ascii="Arial" w:hAnsi="Arial" w:cs="Arial"/>
+          <w:b/>
+          <w:noProof/>
+          <w:color w:val="000000"/>
+          <w:sz w:val="24"/>
+          <w:lang w:eastAsia="en-IN"/>
+        </w:rPr>
+        <w:drawing>
+          <wp:inline distT="0" distB="0" distL="0" distR="0">
+            <wp:extent cx="5731510" cy="3044825"/>
+            <wp:effectExtent l="0" t="0" r="2540" b="3175"/>
+            <wp:docPr id="15" name="Picture 15"/>
+            <wp:cNvGraphicFramePr/>
+            <a:graphic xmlns:a="http://schemas.openxmlformats.org/drawingml/2006/main">
+              <a:graphicData uri="http://schemas.openxmlformats.org/drawingml/2006/picture">
+                <pic:pic xmlns:pic="http://schemas.openxmlformats.org/drawingml/2006/picture">
+                  <pic:nvPicPr>
+                    <pic:cNvPr id="15" name=""/>
+                    <pic:cNvPicPr/>
+                  </pic:nvPicPr>
+                  <pic:blipFill>
+                    <a:blip r:embed="rId18">
+                      <a:extLst>
+                        <a:ext uri="{28A0092B-C50C-407E-A947-70E740481C1C}">
+                          <a14:useLocalDpi xmlns:a14="http://schemas.microsoft.com/office/drawing/2010/main" val="0"/>
+                        </a:ext>
+                      </a:extLst>
+                    </a:blip>
+                    <a:stretch>
+                      <a:fillRect/>
+                    </a:stretch>
+                  </pic:blipFill>
+                  <pic:spPr>
+                    <a:xfrm>
+                      <a:off x="0" y="0"/>
+                      <a:ext cx="5731510" cy="3044825"/>
+                    </a:xfrm>
+                    <a:prstGeom prst="rect">
+                      <a:avLst/>
+                    </a:prstGeom>
+                  </pic:spPr>
+                </pic:pic>
+              </a:graphicData>
+            </a:graphic>
+          </wp:inline>
+        </w:drawing>
+      </w:r>
+    </w:p>
+    <w:p>
+      <w:pPr>
+        <w:jc w:val="center"/>
+        <w:rPr>
+          <w:rFonts w:ascii="Calibri" w:hAnsi="Calibri" w:cs="Calibri"/>
+          <w:b/>
+          <w:color w:val="000000"/>
+        </w:rPr>
+      </w:pPr>
+      <w:r>
+        <w:rPr>
+          <w:rFonts w:ascii="Calibri" w:hAnsi="Calibri" w:cs="Calibri"/>
+          <w:b/>
+          <w:i/>
+          <w:color w:val="000000"/>
+          <w:sz w:val="18"/>
+        </w:rPr>
+        <w:t>Figure 5.6: Kubernetes Manual manifest apply CLI output</w:t>
+      </w:r>
+    </w:p>
+    <w:p>
+      <w:pPr>
+        <w:rPr>
+          <w:rFonts w:ascii="Calibri" w:hAnsi="Calibri" w:cs="Calibri"/>
+          <w:b/>
+          <w:color w:val="000000"/>
+        </w:rPr>
+      </w:pPr>
+    </w:p>
+    <w:p>
+      <w:pPr>
+        <w:rPr>
+          <w:rFonts w:ascii="Arial" w:hAnsi="Arial" w:cs="Arial"/>
+          <w:b/>
+          <w:color w:val="000000"/>
+          <w:sz w:val="32"/>
+        </w:rPr>
+      </w:pPr>
+      <w:r>
+        <w:rPr>
+          <w:rFonts w:ascii="Arial" w:hAnsi="Arial" w:cs="Arial"/>
+          <w:b/>
+          <w:color w:val="000000"/>
+          <w:sz w:val="32"/>
+        </w:rPr>
+        <w:t>6. Centralized Logging &amp; Monitoring Dashboards</w:t>
+      </w:r>
+    </w:p>
+    <w:p>
+      <w:pPr>
+        <w:rPr>
+          <w:rFonts w:ascii="Calibri" w:hAnsi="Calibri" w:cs="Calibri"/>
+          <w:color w:val="000000"/>
+        </w:rPr>
+      </w:pPr>
+      <w:r>
+        <w:rPr>
+          <w:rFonts w:ascii="Calibri" w:hAnsi="Calibri" w:cs="Calibri"/>
+          <w:color w:val="000000"/>
+        </w:rPr>
+        <w:t>Centralized telemetry dashboards monitor cluster behavior using Prometheus metrics, Grafana charts, and Loki log streams.</w:t>
+      </w:r>
+    </w:p>
+    <w:p>
+      <w:pPr>
+        <w:rPr>
+          <w:rFonts w:ascii="Arial" w:hAnsi="Arial" w:cs="Arial"/>
+          <w:b/>
+          <w:color w:val="000000"/>
+          <w:sz w:val="24"/>
+        </w:rPr>
+      </w:pPr>
+      <w:r>
+        <w:rPr>
+          <w:rFonts w:ascii="Arial" w:hAnsi="Arial" w:cs="Arial"/>
+          <w:b/>
+          <w:color w:val="000000"/>
+          <w:sz w:val="24"/>
+        </w:rPr>
+        <w:t>6.1 Grafana Monitoring Dashboard</w:t>
+      </w:r>
+    </w:p>
+    <w:p>
+      <w:pPr>
+        <w:rPr>
+          <w:rFonts w:ascii="Arial" w:hAnsi="Arial" w:cs="Arial"/>
+          <w:b/>
+          <w:color w:val="000000"/>
+          <w:sz w:val="24"/>
+        </w:rPr>
+      </w:pPr>
+    </w:p>
+    <w:p>
+      <w:pPr>
+        <w:jc w:val="center"/>
+        <w:rPr>
+          <w:rFonts w:ascii="Arial" w:hAnsi="Arial" w:cs="Arial"/>
+          <w:b/>
+          <w:color w:val="000000"/>
+          <w:sz w:val="24"/>
+        </w:rPr>
+      </w:pPr>
+      <w:r>
+        <w:rPr>
+          <w:rFonts w:ascii="Arial" w:hAnsi="Arial" w:cs="Arial"/>
+          <w:b/>
+          <w:noProof/>
+          <w:color w:val="000000"/>
+          <w:sz w:val="24"/>
+          <w:lang w:eastAsia="en-IN"/>
+        </w:rPr>
+        <w:drawing>
+          <wp:inline distT="0" distB="0" distL="0" distR="0">
+            <wp:extent cx="4194048" cy="2340864"/>
+            <wp:effectExtent l="0" t="0" r="0" b="2540"/>
+            <wp:docPr id="16" name="Picture 16"/>
+            <wp:cNvGraphicFramePr/>
+            <a:graphic xmlns:a="http://schemas.openxmlformats.org/drawingml/2006/main">
+              <a:graphicData uri="http://schemas.openxmlformats.org/drawingml/2006/picture">
+                <pic:pic xmlns:pic="http://schemas.openxmlformats.org/drawingml/2006/picture">
+                  <pic:nvPicPr>
+                    <pic:cNvPr id="16" name=""/>
+                    <pic:cNvPicPr/>
+                  </pic:nvPicPr>
+                  <pic:blipFill>
+                    <a:blip r:embed="rId19" cstate="print">
                       <a:extLst>
                         <a:ext uri="{28A0092B-C50C-407E-A947-70E740481C1C}">
                           <a14:useLocalDpi xmlns:a14="http://schemas.microsoft.com/office/drawing/2010/main" val="0"/>
@@ -1936,17 +2172,17 @@
           <wp:inline distT="0" distB="0" distL="0" distR="0">
             <wp:extent cx="4194048" cy="2340864"/>
             <wp:effectExtent l="0" t="0" r="0" b="2540"/>
-            <wp:docPr id="15" name="Picture 15"/>
+            <wp:docPr id="17" name="Picture 17"/>
             <wp:cNvGraphicFramePr/>
             <a:graphic xmlns:a="http://schemas.openxmlformats.org/drawingml/2006/main">
               <a:graphicData uri="http://schemas.openxmlformats.org/drawingml/2006/picture">
                 <pic:pic xmlns:pic="http://schemas.openxmlformats.org/drawingml/2006/picture">
                   <pic:nvPicPr>
-                    <pic:cNvPr id="15" name=""/>
+                    <pic:cNvPr id="17" name=""/>
                     <pic:cNvPicPr/>
                   </pic:nvPicPr>
                   <pic:blipFill>
-                    <a:blip r:embed="rId18" cstate="print">
+                    <a:blip r:embed="rId20" cstate="print">
                       <a:extLst>
                         <a:ext uri="{28A0092B-C50C-407E-A947-70E740481C1C}">
                           <a14:useLocalDpi xmlns:a14="http://schemas.microsoft.com/office/drawing/2010/main" val="0"/>

</xml_diff>

<commit_message>
docs: overwrite old placeholders with actual EKS 1.30 and Grafana screenshots
</commit_message>
<xml_diff>
--- a/docs/Project_Submission_Report.docx
+++ b/docs/Project_Submission_Report.docx
@@ -1062,8 +1062,8 @@
         </w:rPr>
         <w:drawing>
           <wp:inline distT="0" distB="0" distL="0" distR="0">
-            <wp:extent cx="5731510" cy="3556000"/>
-            <wp:effectExtent l="0" t="0" r="2540" b="6350"/>
+            <wp:extent cx="5731510" cy="3044825"/>
+            <wp:effectExtent l="0" t="0" r="2540" b="3175"/>
             <wp:docPr id="8" name="Picture 8"/>
             <wp:cNvGraphicFramePr/>
             <a:graphic xmlns:a="http://schemas.openxmlformats.org/drawingml/2006/main">
@@ -1088,7 +1088,7 @@
                   <pic:spPr>
                     <a:xfrm>
                       <a:off x="0" y="0"/>
-                      <a:ext cx="5731510" cy="3556000"/>
+                      <a:ext cx="5731510" cy="3044825"/>
                     </a:xfrm>
                     <a:prstGeom prst="rect">
                       <a:avLst/>

</xml_diff>

<commit_message>
docs: map green pipeline run 13 and cluster active details
</commit_message>
<xml_diff>
--- a/docs/Project_Submission_Report.docx
+++ b/docs/Project_Submission_Report.docx
@@ -910,8 +910,8 @@
         </w:rPr>
         <w:drawing>
           <wp:inline distT="0" distB="0" distL="0" distR="0">
-            <wp:extent cx="5731510" cy="3122930"/>
-            <wp:effectExtent l="0" t="0" r="2540" b="1270"/>
+            <wp:extent cx="5731510" cy="3044825"/>
+            <wp:effectExtent l="0" t="0" r="2540" b="3175"/>
             <wp:docPr id="7" name="Picture 7"/>
             <wp:cNvGraphicFramePr/>
             <a:graphic xmlns:a="http://schemas.openxmlformats.org/drawingml/2006/main">
@@ -936,7 +936,7 @@
                   <pic:spPr>
                     <a:xfrm>
                       <a:off x="0" y="0"/>
-                      <a:ext cx="5731510" cy="3122930"/>
+                      <a:ext cx="5731510" cy="3044825"/>
                     </a:xfrm>
                     <a:prstGeom prst="rect">
                       <a:avLst/>
@@ -1912,7 +1912,7 @@
                     <pic:cNvPicPr/>
                   </pic:nvPicPr>
                   <pic:blipFill>
-                    <a:blip r:embed="rId18">
+                    <a:blip r:embed="rId10">
                       <a:extLst>
                         <a:ext uri="{28A0092B-C50C-407E-A947-70E740481C1C}">
                           <a14:useLocalDpi xmlns:a14="http://schemas.microsoft.com/office/drawing/2010/main" val="0"/>
@@ -2064,7 +2064,7 @@
                     <pic:cNvPicPr/>
                   </pic:nvPicPr>
                   <pic:blipFill>
-                    <a:blip r:embed="rId19" cstate="print">
+                    <a:blip r:embed="rId18" cstate="print">
                       <a:extLst>
                         <a:ext uri="{28A0092B-C50C-407E-A947-70E740481C1C}">
                           <a14:useLocalDpi xmlns:a14="http://schemas.microsoft.com/office/drawing/2010/main" val="0"/>
@@ -2182,7 +2182,7 @@
                     <pic:cNvPicPr/>
                   </pic:nvPicPr>
                   <pic:blipFill>
-                    <a:blip r:embed="rId20" cstate="print">
+                    <a:blip r:embed="rId19" cstate="print">
                       <a:extLst>
                         <a:ext uri="{28A0092B-C50C-407E-A947-70E740481C1C}">
                           <a14:useLocalDpi xmlns:a14="http://schemas.microsoft.com/office/drawing/2010/main" val="0"/>

</xml_diff>

<commit_message>
docs: finalize report and README with actual EKS cluster screenshots and clean old duplicates
</commit_message>
<xml_diff>
--- a/docs/Project_Submission_Report.docx
+++ b/docs/Project_Submission_Report.docx
@@ -804,7 +804,7 @@
                     <pic:cNvPicPr/>
                   </pic:nvPicPr>
                   <pic:blipFill>
-                    <a:blip r:embed="rId9">
+                    <a:blip r:embed="rId9" cstate="print">
                       <a:extLst>
                         <a:ext uri="{28A0092B-C50C-407E-A947-70E740481C1C}">
                           <a14:useLocalDpi xmlns:a14="http://schemas.microsoft.com/office/drawing/2010/main" val="0"/>
@@ -922,7 +922,7 @@
                     <pic:cNvPicPr/>
                   </pic:nvPicPr>
                   <pic:blipFill>
-                    <a:blip r:embed="rId10">
+                    <a:blip r:embed="rId10" cstate="print">
                       <a:extLst>
                         <a:ext uri="{28A0092B-C50C-407E-A947-70E740481C1C}">
                           <a14:useLocalDpi xmlns:a14="http://schemas.microsoft.com/office/drawing/2010/main" val="0"/>
@@ -1062,8 +1062,8 @@
         </w:rPr>
         <w:drawing>
           <wp:inline distT="0" distB="0" distL="0" distR="0">
-            <wp:extent cx="5731510" cy="3044825"/>
-            <wp:effectExtent l="0" t="0" r="2540" b="3175"/>
+            <wp:extent cx="5731510" cy="2623820"/>
+            <wp:effectExtent l="0" t="0" r="2540" b="5080"/>
             <wp:docPr id="8" name="Picture 8"/>
             <wp:cNvGraphicFramePr/>
             <a:graphic xmlns:a="http://schemas.openxmlformats.org/drawingml/2006/main">
@@ -1074,7 +1074,7 @@
                     <pic:cNvPicPr/>
                   </pic:nvPicPr>
                   <pic:blipFill>
-                    <a:blip r:embed="rId11">
+                    <a:blip r:embed="rId11" cstate="print">
                       <a:extLst>
                         <a:ext uri="{28A0092B-C50C-407E-A947-70E740481C1C}">
                           <a14:useLocalDpi xmlns:a14="http://schemas.microsoft.com/office/drawing/2010/main" val="0"/>
@@ -1088,7 +1088,7 @@
                   <pic:spPr>
                     <a:xfrm>
                       <a:off x="0" y="0"/>
-                      <a:ext cx="5731510" cy="3044825"/>
+                      <a:ext cx="5731510" cy="2623820"/>
                     </a:xfrm>
                     <a:prstGeom prst="rect">
                       <a:avLst/>
@@ -1180,8 +1180,8 @@
         </w:rPr>
         <w:drawing>
           <wp:inline distT="0" distB="0" distL="0" distR="0">
-            <wp:extent cx="5731510" cy="3805555"/>
-            <wp:effectExtent l="0" t="0" r="2540" b="4445"/>
+            <wp:extent cx="5731510" cy="3554095"/>
+            <wp:effectExtent l="0" t="0" r="2540" b="8255"/>
             <wp:docPr id="9" name="Picture 9"/>
             <wp:cNvGraphicFramePr/>
             <a:graphic xmlns:a="http://schemas.openxmlformats.org/drawingml/2006/main">
@@ -1206,7 +1206,7 @@
                   <pic:spPr>
                     <a:xfrm>
                       <a:off x="0" y="0"/>
-                      <a:ext cx="5731510" cy="3805555"/>
+                      <a:ext cx="5731510" cy="3554095"/>
                     </a:xfrm>
                     <a:prstGeom prst="rect">
                       <a:avLst/>
@@ -1912,7 +1912,7 @@
                     <pic:cNvPicPr/>
                   </pic:nvPicPr>
                   <pic:blipFill>
-                    <a:blip r:embed="rId10">
+                    <a:blip r:embed="rId17">
                       <a:extLst>
                         <a:ext uri="{28A0092B-C50C-407E-A947-70E740481C1C}">
                           <a14:useLocalDpi xmlns:a14="http://schemas.microsoft.com/office/drawing/2010/main" val="0"/>
@@ -2052,8 +2052,8 @@
         </w:rPr>
         <w:drawing>
           <wp:inline distT="0" distB="0" distL="0" distR="0">
-            <wp:extent cx="4194048" cy="2340864"/>
-            <wp:effectExtent l="0" t="0" r="0" b="2540"/>
+            <wp:extent cx="5731510" cy="3044825"/>
+            <wp:effectExtent l="0" t="0" r="2540" b="3175"/>
             <wp:docPr id="16" name="Picture 16"/>
             <wp:cNvGraphicFramePr/>
             <a:graphic xmlns:a="http://schemas.openxmlformats.org/drawingml/2006/main">
@@ -2078,7 +2078,7 @@
                   <pic:spPr>
                     <a:xfrm>
                       <a:off x="0" y="0"/>
-                      <a:ext cx="4194048" cy="2340864"/>
+                      <a:ext cx="5731510" cy="3044825"/>
                     </a:xfrm>
                     <a:prstGeom prst="rect">
                       <a:avLst/>
@@ -2170,8 +2170,8 @@
         </w:rPr>
         <w:drawing>
           <wp:inline distT="0" distB="0" distL="0" distR="0">
-            <wp:extent cx="4194048" cy="2340864"/>
-            <wp:effectExtent l="0" t="0" r="0" b="2540"/>
+            <wp:extent cx="5731510" cy="3044825"/>
+            <wp:effectExtent l="0" t="0" r="2540" b="3175"/>
             <wp:docPr id="17" name="Picture 17"/>
             <wp:cNvGraphicFramePr/>
             <a:graphic xmlns:a="http://schemas.openxmlformats.org/drawingml/2006/main">
@@ -2196,7 +2196,7 @@
                   <pic:spPr>
                     <a:xfrm>
                       <a:off x="0" y="0"/>
-                      <a:ext cx="4194048" cy="2340864"/>
+                      <a:ext cx="5731510" cy="3044825"/>
                     </a:xfrm>
                     <a:prstGeom prst="rect">
                       <a:avLst/>

</xml_diff>